<commit_message>
Fix medical dialogue case cross-reference
</commit_message>
<xml_diff>
--- a/18_DOCX/MED_CASES_0017_0024.docx
+++ b/18_DOCX/MED_CASES_0017_0024.docx
@@ -3573,6 +3573,30 @@
     </w:p>
     <w:p>
       <w:pPr>
+        <w:pStyle w:val="ListBullet"/>
+      </w:pPr>
+      <w:r>
+        <w:t>MED-0058</w:t>
+      </w:r>
+    </w:p>
+    <w:p>
+      <w:pPr>
+        <w:pStyle w:val="ListBullet"/>
+      </w:pPr>
+      <w:r>
+        <w:t>MED-0059</w:t>
+      </w:r>
+    </w:p>
+    <w:p>
+      <w:pPr>
+        <w:pStyle w:val="ListBullet"/>
+      </w:pPr>
+      <w:r>
+        <w:t>MED-0060</w:t>
+      </w:r>
+    </w:p>
+    <w:p>
+      <w:pPr>
         <w:pStyle w:val="Heading2"/>
       </w:pPr>
       <w:r>
@@ -3605,6 +3629,30 @@
     </w:p>
     <w:p>
       <w:pPr>
+        <w:pStyle w:val="ListBullet"/>
+      </w:pPr>
+      <w:r>
+        <w:t>FAQ-MED-0058</w:t>
+      </w:r>
+    </w:p>
+    <w:p>
+      <w:pPr>
+        <w:pStyle w:val="ListBullet"/>
+      </w:pPr>
+      <w:r>
+        <w:t>FAQ-MED-0059</w:t>
+      </w:r>
+    </w:p>
+    <w:p>
+      <w:pPr>
+        <w:pStyle w:val="ListBullet"/>
+      </w:pPr>
+      <w:r>
+        <w:t>FAQ-MED-0060</w:t>
+      </w:r>
+    </w:p>
+    <w:p>
+      <w:pPr>
         <w:pStyle w:val="Heading2"/>
       </w:pPr>
       <w:r>
@@ -3621,6 +3669,14 @@
     </w:p>
     <w:p>
       <w:pPr>
+        <w:pStyle w:val="ListBullet"/>
+      </w:pPr>
+      <w:r>
+        <w:t>DIALOGUE-MED-0015</w:t>
+      </w:r>
+    </w:p>
+    <w:p>
+      <w:pPr>
         <w:pStyle w:val="Heading2"/>
       </w:pPr>
       <w:r>
@@ -3656,6 +3712,30 @@
         <w:pStyle w:val="ListBullet"/>
       </w:pPr>
       <w:r>
+        <w:t>MED-0058</w:t>
+      </w:r>
+    </w:p>
+    <w:p>
+      <w:pPr>
+        <w:pStyle w:val="ListBullet"/>
+      </w:pPr>
+      <w:r>
+        <w:t>MED-0059</w:t>
+      </w:r>
+    </w:p>
+    <w:p>
+      <w:pPr>
+        <w:pStyle w:val="ListBullet"/>
+      </w:pPr>
+      <w:r>
+        <w:t>MED-0060</w:t>
+      </w:r>
+    </w:p>
+    <w:p>
+      <w:pPr>
+        <w:pStyle w:val="ListBullet"/>
+      </w:pPr>
+      <w:r>
         <w:t>FAQ-MED-0055</w:t>
       </w:r>
     </w:p>
@@ -3680,11 +3760,43 @@
         <w:pStyle w:val="ListBullet"/>
       </w:pPr>
       <w:r>
+        <w:t>FAQ-MED-0058</w:t>
+      </w:r>
+    </w:p>
+    <w:p>
+      <w:pPr>
+        <w:pStyle w:val="ListBullet"/>
+      </w:pPr>
+      <w:r>
+        <w:t>FAQ-MED-0059</w:t>
+      </w:r>
+    </w:p>
+    <w:p>
+      <w:pPr>
+        <w:pStyle w:val="ListBullet"/>
+      </w:pPr>
+      <w:r>
+        <w:t>FAQ-MED-0060</w:t>
+      </w:r>
+    </w:p>
+    <w:p>
+      <w:pPr>
+        <w:pStyle w:val="ListBullet"/>
+      </w:pPr>
+      <w:r>
         <w:t>DIALOGUE-MED-0014</w:t>
       </w:r>
     </w:p>
     <w:p>
       <w:pPr>
+        <w:pStyle w:val="ListBullet"/>
+      </w:pPr>
+      <w:r>
+        <w:t>DIALOGUE-MED-0015</w:t>
+      </w:r>
+    </w:p>
+    <w:p>
+      <w:pPr>
         <w:pStyle w:val="Heading2"/>
       </w:pPr>
       <w:r>
@@ -3753,6 +3865,14 @@
       </w:pPr>
       <w:r>
         <w:t>`13_Dialogues/MED/DIALOGUE-MED-0014.md`</w:t>
+      </w:r>
+    </w:p>
+    <w:p>
+      <w:pPr>
+        <w:pStyle w:val="ListBullet"/>
+      </w:pPr>
+      <w:r>
+        <w:t>`13_Dialogues/MED/DIALOGUE-MED-0015.md`</w:t>
       </w:r>
     </w:p>
     <w:p>
@@ -4255,7 +4375,6 @@
     </w:pPr>
     <w:rPr>
       <w:rFonts w:ascii="Arial" w:hAnsi="Arial" w:eastAsia="Yu Gothic"/>
-      <w:sz w:val="18"/>
     </w:rPr>
   </w:style>
   <w:style w:type="character" w:customStyle="1" w:styleId="HeaderChar">
@@ -4281,7 +4400,6 @@
     </w:pPr>
     <w:rPr>
       <w:rFonts w:ascii="Arial" w:hAnsi="Arial" w:eastAsia="Yu Gothic"/>
-      <w:sz w:val="18"/>
     </w:rPr>
   </w:style>
   <w:style w:type="character" w:customStyle="1" w:styleId="FooterChar">
@@ -4310,7 +4428,7 @@
       <w:b/>
       <w:bCs/>
       <w:color w:val="365F91" w:themeColor="accent1" w:themeShade="BF"/>
-      <w:sz w:val="18"/>
+      <w:sz w:val="28"/>
       <w:szCs w:val="28"/>
     </w:rPr>
   </w:style>
@@ -4334,7 +4452,7 @@
       <w:b/>
       <w:bCs/>
       <w:color w:val="4F81BD" w:themeColor="accent1"/>
-      <w:sz w:val="18"/>
+      <w:sz w:val="26"/>
       <w:szCs w:val="26"/>
     </w:rPr>
   </w:style>
@@ -4358,7 +4476,6 @@
       <w:b/>
       <w:bCs/>
       <w:color w:val="4F81BD" w:themeColor="accent1"/>
-      <w:sz w:val="18"/>
     </w:rPr>
   </w:style>
   <w:style w:type="paragraph" w:styleId="Heading4">
@@ -4384,7 +4501,6 @@
       <w:i/>
       <w:iCs/>
       <w:color w:val="4F81BD" w:themeColor="accent1"/>
-      <w:sz w:val="18"/>
     </w:rPr>
   </w:style>
   <w:style w:type="paragraph" w:styleId="Heading5">
@@ -4406,7 +4522,6 @@
     <w:rPr>
       <w:rFonts w:asciiTheme="majorHAnsi" w:eastAsiaTheme="majorEastAsia" w:hAnsiTheme="majorHAnsi" w:cstheme="majorBidi" w:ascii="Arial" w:hAnsi="Arial" w:eastAsia="Yu Gothic"/>
       <w:color w:val="243F60" w:themeColor="accent1" w:themeShade="7F"/>
-      <w:sz w:val="18"/>
     </w:rPr>
   </w:style>
   <w:style w:type="paragraph" w:styleId="Heading6">
@@ -4430,7 +4545,6 @@
       <w:i/>
       <w:iCs/>
       <w:color w:val="243F60" w:themeColor="accent1" w:themeShade="7F"/>
-      <w:sz w:val="18"/>
     </w:rPr>
   </w:style>
   <w:style w:type="paragraph" w:styleId="Heading7">
@@ -4454,7 +4568,6 @@
       <w:i/>
       <w:iCs/>
       <w:color w:val="404040" w:themeColor="text1" w:themeTint="BF"/>
-      <w:sz w:val="18"/>
     </w:rPr>
   </w:style>
   <w:style w:type="paragraph" w:styleId="Heading8">
@@ -4476,7 +4589,7 @@
     <w:rPr>
       <w:rFonts w:asciiTheme="majorHAnsi" w:eastAsiaTheme="majorEastAsia" w:hAnsiTheme="majorHAnsi" w:cstheme="majorBidi" w:ascii="Arial" w:hAnsi="Arial" w:eastAsia="Yu Gothic"/>
       <w:color w:val="4F81BD" w:themeColor="accent1"/>
-      <w:sz w:val="18"/>
+      <w:sz w:val="20"/>
       <w:szCs w:val="20"/>
     </w:rPr>
   </w:style>
@@ -4501,7 +4614,7 @@
       <w:i/>
       <w:iCs/>
       <w:color w:val="404040" w:themeColor="text1" w:themeTint="BF"/>
-      <w:sz w:val="18"/>
+      <w:sz w:val="20"/>
       <w:szCs w:val="20"/>
     </w:rPr>
   </w:style>
@@ -4542,7 +4655,6 @@
     </w:pPr>
     <w:rPr>
       <w:rFonts w:ascii="Arial" w:hAnsi="Arial" w:eastAsia="Yu Gothic"/>
-      <w:sz w:val="18"/>
     </w:rPr>
   </w:style>
   <w:style w:type="character" w:customStyle="1" w:styleId="Heading1Char">
@@ -4608,7 +4720,7 @@
       <w:color w:val="17365D" w:themeColor="text2" w:themeShade="BF"/>
       <w:spacing w:val="5"/>
       <w:kern w:val="28"/>
-      <w:sz w:val="18"/>
+      <w:sz w:val="52"/>
       <w:szCs w:val="52"/>
     </w:rPr>
   </w:style>
@@ -4646,7 +4758,7 @@
       <w:iCs/>
       <w:color w:val="4F81BD" w:themeColor="accent1"/>
       <w:spacing w:val="15"/>
-      <w:sz w:val="18"/>
+      <w:sz w:val="24"/>
       <w:szCs w:val="24"/>
     </w:rPr>
   </w:style>
@@ -4678,7 +4790,6 @@
     </w:pPr>
     <w:rPr>
       <w:rFonts w:ascii="Arial" w:hAnsi="Arial" w:eastAsia="Yu Gothic"/>
-      <w:sz w:val="18"/>
     </w:rPr>
   </w:style>
   <w:style w:type="paragraph" w:styleId="BodyText">
@@ -4693,7 +4804,6 @@
     </w:pPr>
     <w:rPr>
       <w:rFonts w:ascii="Arial" w:hAnsi="Arial" w:eastAsia="Yu Gothic"/>
-      <w:sz w:val="18"/>
     </w:rPr>
   </w:style>
   <w:style w:type="character" w:customStyle="1" w:styleId="BodyTextChar">
@@ -4715,7 +4825,6 @@
     </w:pPr>
     <w:rPr>
       <w:rFonts w:ascii="Arial" w:hAnsi="Arial" w:eastAsia="Yu Gothic"/>
-      <w:sz w:val="18"/>
     </w:rPr>
   </w:style>
   <w:style w:type="character" w:customStyle="1" w:styleId="BodyText2Char">
@@ -4737,7 +4846,7 @@
     </w:pPr>
     <w:rPr>
       <w:rFonts w:ascii="Arial" w:hAnsi="Arial" w:eastAsia="Yu Gothic"/>
-      <w:sz w:val="18"/>
+      <w:sz w:val="16"/>
       <w:szCs w:val="16"/>
     </w:rPr>
   </w:style>
@@ -4764,7 +4873,6 @@
     </w:pPr>
     <w:rPr>
       <w:rFonts w:ascii="Arial" w:hAnsi="Arial" w:eastAsia="Yu Gothic"/>
-      <w:sz w:val="18"/>
     </w:rPr>
   </w:style>
   <w:style w:type="paragraph" w:styleId="List2">
@@ -4779,7 +4887,6 @@
     </w:pPr>
     <w:rPr>
       <w:rFonts w:ascii="Arial" w:hAnsi="Arial" w:eastAsia="Yu Gothic"/>
-      <w:sz w:val="18"/>
     </w:rPr>
   </w:style>
   <w:style w:type="paragraph" w:styleId="List3">
@@ -4794,7 +4901,6 @@
     </w:pPr>
     <w:rPr>
       <w:rFonts w:ascii="Arial" w:hAnsi="Arial" w:eastAsia="Yu Gothic"/>
-      <w:sz w:val="18"/>
     </w:rPr>
   </w:style>
   <w:style w:type="paragraph" w:styleId="ListBullet">
@@ -4811,7 +4917,6 @@
     </w:pPr>
     <w:rPr>
       <w:rFonts w:ascii="Arial" w:hAnsi="Arial" w:eastAsia="Yu Gothic"/>
-      <w:sz w:val="18"/>
     </w:rPr>
   </w:style>
   <w:style w:type="paragraph" w:styleId="ListBullet2">
@@ -4828,7 +4933,6 @@
     </w:pPr>
     <w:rPr>
       <w:rFonts w:ascii="Arial" w:hAnsi="Arial" w:eastAsia="Yu Gothic"/>
-      <w:sz w:val="18"/>
     </w:rPr>
   </w:style>
   <w:style w:type="paragraph" w:styleId="ListBullet3">
@@ -4845,7 +4949,6 @@
     </w:pPr>
     <w:rPr>
       <w:rFonts w:ascii="Arial" w:hAnsi="Arial" w:eastAsia="Yu Gothic"/>
-      <w:sz w:val="18"/>
     </w:rPr>
   </w:style>
   <w:style w:type="paragraph" w:styleId="ListNumber">
@@ -4862,7 +4965,6 @@
     </w:pPr>
     <w:rPr>
       <w:rFonts w:ascii="Arial" w:hAnsi="Arial" w:eastAsia="Yu Gothic"/>
-      <w:sz w:val="18"/>
     </w:rPr>
   </w:style>
   <w:style w:type="paragraph" w:styleId="ListNumber2">
@@ -4879,7 +4981,6 @@
     </w:pPr>
     <w:rPr>
       <w:rFonts w:ascii="Arial" w:hAnsi="Arial" w:eastAsia="Yu Gothic"/>
-      <w:sz w:val="18"/>
     </w:rPr>
   </w:style>
   <w:style w:type="paragraph" w:styleId="ListNumber3">
@@ -4896,7 +4997,6 @@
     </w:pPr>
     <w:rPr>
       <w:rFonts w:ascii="Arial" w:hAnsi="Arial" w:eastAsia="Yu Gothic"/>
-      <w:sz w:val="18"/>
     </w:rPr>
   </w:style>
   <w:style w:type="paragraph" w:styleId="ListContinue">
@@ -4912,7 +5012,6 @@
     </w:pPr>
     <w:rPr>
       <w:rFonts w:ascii="Arial" w:hAnsi="Arial" w:eastAsia="Yu Gothic"/>
-      <w:sz w:val="18"/>
     </w:rPr>
   </w:style>
   <w:style w:type="paragraph" w:styleId="ListContinue2">
@@ -4928,7 +5027,6 @@
     </w:pPr>
     <w:rPr>
       <w:rFonts w:ascii="Arial" w:hAnsi="Arial" w:eastAsia="Yu Gothic"/>
-      <w:sz w:val="18"/>
     </w:rPr>
   </w:style>
   <w:style w:type="paragraph" w:styleId="ListContinue3">
@@ -4944,7 +5042,6 @@
     </w:pPr>
     <w:rPr>
       <w:rFonts w:ascii="Arial" w:hAnsi="Arial" w:eastAsia="Yu Gothic"/>
-      <w:sz w:val="18"/>
     </w:rPr>
   </w:style>
   <w:style w:type="paragraph" w:styleId="MacroText">
@@ -4966,7 +5063,7 @@
     </w:pPr>
     <w:rPr>
       <w:rFonts w:ascii="Arial" w:hAnsi="Arial" w:eastAsia="Yu Gothic"/>
-      <w:sz w:val="18"/>
+      <w:sz w:val="20"/>
       <w:szCs w:val="20"/>
     </w:rPr>
   </w:style>
@@ -4995,7 +5092,6 @@
       <w:i/>
       <w:iCs/>
       <w:color w:val="000000" w:themeColor="text1"/>
-      <w:sz w:val="18"/>
     </w:rPr>
   </w:style>
   <w:style w:type="character" w:customStyle="1" w:styleId="QuoteChar">
@@ -5161,7 +5257,6 @@
       <w:i/>
       <w:iCs/>
       <w:color w:val="4F81BD" w:themeColor="accent1"/>
-      <w:sz w:val="18"/>
     </w:rPr>
   </w:style>
   <w:style w:type="character" w:customStyle="1" w:styleId="IntenseQuoteChar">
@@ -5258,7 +5353,6 @@
     </w:pPr>
     <w:rPr>
       <w:rFonts w:ascii="Arial" w:hAnsi="Arial" w:eastAsia="Yu Gothic"/>
-      <w:sz w:val="18"/>
     </w:rPr>
   </w:style>
   <w:style w:type="table" w:styleId="TableGrid">

</xml_diff>